<commit_message>
Use canonical UML for lab 2 use case deployment and components
</commit_message>
<xml_diff>
--- a/docs/lab-02/Технический_проект.docx
+++ b/docs/lab-02/Технический_проект.docx
@@ -143,7 +143,7 @@
     </w:p>
     <w:p>
       <w:r>
-        <w:t>Пользователь создаёт намерения и места, получает список, завершает или переносит дело, просматривает причину срабатывания и запускает симуляцию. Android участвует в доставке события и уведомления. Подтверждение визита — включаемый внутренний шаг для реального и симулированного сценария.</w:t>
+        <w:t>Пользователь создаёт намерения и места, получает список, завершает или переносит дело, просматривает причину срабатывания и запускает симуляцию. Android участвует в доставке события и уведомления. Диаграмма использует канонические элементы UML: акторов, овалы вариантов использования, границу системы, ассоциации и связи «include». Подтверждение визита — включаемый внутренний шаг для реального и симулированного сценария.</w:t>
       </w:r>
     </w:p>
     <w:p>
@@ -154,7 +154,7 @@
       <w:r>
         <w:drawing>
           <wp:inline xmlns:a="http://schemas.openxmlformats.org/drawingml/2006/main" xmlns:pic="http://schemas.openxmlformats.org/drawingml/2006/picture">
-            <wp:extent cx="6263999" cy="4552282"/>
+            <wp:extent cx="5965486" cy="6300000"/>
             <wp:docPr id="2" name="Picture 2"/>
             <wp:cNvGraphicFramePr>
               <a:graphicFrameLocks noChangeAspect="1"/>
@@ -175,7 +175,7 @@
                   <pic:spPr>
                     <a:xfrm>
                       <a:off x="0" y="0"/>
-                      <a:ext cx="6263999" cy="4552282"/>
+                      <a:ext cx="5965486" cy="6300000"/>
                     </a:xfrm>
                     <a:prstGeom prst="rect"/>
                   </pic:spPr>
@@ -200,7 +200,7 @@
     </w:p>
     <w:p>
       <w:r>
-        <w:t>Редактируемый исходник: 02-use-case.mmd (diagrams/02-use-case.mmd). Соответствие UC и критериев приёмки дано в ТЗ (Техническое_задание.md#5-основные-сценарии-использования).</w:t>
+        <w:t>Редактируемый исходник PlantUML: 02-use-case.puml (diagrams/02-use-case.puml). Соответствие UC и критериев приёмки дано в ТЗ (Техническое_задание.md#5-основные-сценарии-использования).</w:t>
       </w:r>
     </w:p>
     <w:p>
@@ -293,7 +293,7 @@
     </w:p>
     <w:p>
       <w:r>
-        <w:t>Все компоненты приложения и БД размещены на смартфоне. Системный провайдер местоположения и Android API не являются нашим сервером. Внешняя сеть не нужна для базовых операций. Samsung Galaxy S25 обозначен как устройство испытания, а не единственная поддерживаемая модель.</w:t>
+        <w:t>Все артефакты приложения и БД размещены на узле-устройстве. Внутри показаны среды выполнения Android и GoCue, а также системные службы геолокации и уведомлений. Внешняя сеть не нужна для базовых операций. Samsung Galaxy S25 обозначен как устройство испытания, а не единственная поддерживаемая модель.</w:t>
       </w:r>
     </w:p>
     <w:p>
@@ -304,7 +304,7 @@
       <w:r>
         <w:drawing>
           <wp:inline xmlns:a="http://schemas.openxmlformats.org/drawingml/2006/main" xmlns:pic="http://schemas.openxmlformats.org/drawingml/2006/picture">
-            <wp:extent cx="6263999" cy="4393032"/>
+            <wp:extent cx="6129729" cy="6300000"/>
             <wp:docPr id="4" name="Picture 4"/>
             <wp:cNvGraphicFramePr>
               <a:graphicFrameLocks noChangeAspect="1"/>
@@ -325,7 +325,7 @@
                   <pic:spPr>
                     <a:xfrm>
                       <a:off x="0" y="0"/>
-                      <a:ext cx="6263999" cy="4393032"/>
+                      <a:ext cx="6129729" cy="6300000"/>
                     </a:xfrm>
                     <a:prstGeom prst="rect"/>
                   </pic:spPr>
@@ -350,7 +350,7 @@
     </w:p>
     <w:p>
       <w:r>
-        <w:t>Редактируемый исходник: 04-deployment.mmd (diagrams/04-deployment.mmd).</w:t>
+        <w:t>Редактируемый исходник PlantUML: 04-deployment.puml (diagrams/04-deployment.puml).</w:t>
       </w:r>
     </w:p>
     <w:p>
@@ -368,7 +368,7 @@
     </w:p>
     <w:p>
       <w:r>
-        <w:t>Поток данных: GeofenceManager → PresenceEngine → ContextSnapshotBuilder → IntentEngine → NotificationCoordinator. PlaceResolver добавляет к физическому месту роли и семантические имена. Репозитории скрывают хранение. Интерфейс и симулятор используют те же правила, что и реальные системные события.</w:t>
+        <w:t>Поток данных: GeofenceManager → PresenceEngine → ContextSnapshotBuilder → IntentEngine → NotificationCoordinator. На UML-диаграмме показаны символы компонентов UML2, составной компонент Core Logic, зависимости и подписанные контракты ContextSnapshot и EligibleIntents. PlaceResolver добавляет к физическому месту роли и семантические имена. Репозитории скрывают хранение. Интерфейс и симулятор используют те же правила, что и реальные системные события.</w:t>
       </w:r>
     </w:p>
     <w:p>
@@ -379,7 +379,7 @@
       <w:r>
         <w:drawing>
           <wp:inline xmlns:a="http://schemas.openxmlformats.org/drawingml/2006/main" xmlns:pic="http://schemas.openxmlformats.org/drawingml/2006/picture">
-            <wp:extent cx="6263999" cy="3427471"/>
+            <wp:extent cx="5669275" cy="6300000"/>
             <wp:docPr id="5" name="Picture 5"/>
             <wp:cNvGraphicFramePr>
               <a:graphicFrameLocks noChangeAspect="1"/>
@@ -400,7 +400,7 @@
                   <pic:spPr>
                     <a:xfrm>
                       <a:off x="0" y="0"/>
-                      <a:ext cx="6263999" cy="3427471"/>
+                      <a:ext cx="5669275" cy="6300000"/>
                     </a:xfrm>
                     <a:prstGeom prst="rect"/>
                   </pic:spPr>
@@ -425,7 +425,7 @@
     </w:p>
     <w:p>
       <w:r>
-        <w:t>Редактируемый исходник: 05-components.mmd (diagrams/05-components.mmd).</w:t>
+        <w:t>Редактируемый исходник PlantUML: 05-components.puml (diagrams/05-components.puml).</w:t>
       </w:r>
     </w:p>
     <w:p>
@@ -1155,7 +1155,7 @@
     </w:p>
     <w:p>
       <w:r>
-        <w:t>Основание: исходная спецификация (../product-spec.md) и ТЗ ЛР2 (Техническое_задание.md). Все диаграммы доступны как редактируемые .mmd файлы в репозитории, их визуализации встроены в этот документ. Ссылка на ресурс: &lt;https://github.com/techmo0/GoCue/tree/main/docs/lab-02&gt;.</w:t>
+        <w:t>Основание: исходная спецификация (../product-spec.md) и ТЗ ЛР2 (Техническое_задание.md). Все диаграммы доступны как редактируемые .mmd/.puml файлы в репозитории, их визуализации встроены в этот документ. Ссылка на ресурс: &lt;https://github.com/techmo0/GoCue/tree/main/docs/lab-02&gt;.</w:t>
       </w:r>
     </w:p>
     <w:sectPr>

</xml_diff>

<commit_message>
Convert all lab 2 diagrams to PlantUML
</commit_message>
<xml_diff>
--- a/docs/lab-02/Технический_проект.docx
+++ b/docs/lab-02/Технический_проект.docx
@@ -79,7 +79,7 @@
       <w:r>
         <w:drawing>
           <wp:inline xmlns:a="http://schemas.openxmlformats.org/drawingml/2006/main" xmlns:pic="http://schemas.openxmlformats.org/drawingml/2006/picture">
-            <wp:extent cx="6263999" cy="3159964"/>
+            <wp:extent cx="6263999" cy="1686461"/>
             <wp:docPr id="1" name="Picture 1"/>
             <wp:cNvGraphicFramePr>
               <a:graphicFrameLocks noChangeAspect="1"/>
@@ -100,7 +100,7 @@
                   <pic:spPr>
                     <a:xfrm>
                       <a:off x="0" y="0"/>
-                      <a:ext cx="6263999" cy="3159964"/>
+                      <a:ext cx="6263999" cy="1686461"/>
                     </a:xfrm>
                     <a:prstGeom prst="rect"/>
                   </pic:spPr>
@@ -125,7 +125,7 @@
     </w:p>
     <w:p>
       <w:r>
-        <w:t>Редактируемый исходник: 01-context.mmd (diagrams/01-context.mmd).</w:t>
+        <w:t>Редактируемый исходник PlantUML: 01-context.puml (diagrams/01-context.puml).</w:t>
       </w:r>
     </w:p>
     <w:p>
@@ -229,7 +229,7 @@
       <w:r>
         <w:drawing>
           <wp:inline xmlns:a="http://schemas.openxmlformats.org/drawingml/2006/main" xmlns:pic="http://schemas.openxmlformats.org/drawingml/2006/picture">
-            <wp:extent cx="6263999" cy="5803763"/>
+            <wp:extent cx="5308593" cy="6300000"/>
             <wp:docPr id="3" name="Picture 3"/>
             <wp:cNvGraphicFramePr>
               <a:graphicFrameLocks noChangeAspect="1"/>
@@ -250,7 +250,7 @@
                   <pic:spPr>
                     <a:xfrm>
                       <a:off x="0" y="0"/>
-                      <a:ext cx="6263999" cy="5803763"/>
+                      <a:ext cx="5308593" cy="6300000"/>
                     </a:xfrm>
                     <a:prstGeom prst="rect"/>
                   </pic:spPr>
@@ -275,7 +275,7 @@
     </w:p>
     <w:p>
       <w:r>
-        <w:t>Редактируемый исходник: 03-class.mmd (diagrams/03-class.mmd).</w:t>
+        <w:t>Редактируемый исходник PlantUML: 03-class.puml (diagrams/03-class.puml).</w:t>
       </w:r>
     </w:p>
     <w:p>
@@ -454,7 +454,7 @@
       <w:r>
         <w:drawing>
           <wp:inline xmlns:a="http://schemas.openxmlformats.org/drawingml/2006/main" xmlns:pic="http://schemas.openxmlformats.org/drawingml/2006/picture">
-            <wp:extent cx="2423459" cy="6300000"/>
+            <wp:extent cx="6263999" cy="5425806"/>
             <wp:docPr id="6" name="Picture 6"/>
             <wp:cNvGraphicFramePr>
               <a:graphicFrameLocks noChangeAspect="1"/>
@@ -475,7 +475,7 @@
                   <pic:spPr>
                     <a:xfrm>
                       <a:off x="0" y="0"/>
-                      <a:ext cx="2423459" cy="6300000"/>
+                      <a:ext cx="6263999" cy="5425806"/>
                     </a:xfrm>
                     <a:prstGeom prst="rect"/>
                   </pic:spPr>
@@ -500,7 +500,7 @@
     </w:p>
     <w:p>
       <w:r>
-        <w:t>Редактируемый исходник: 06-activity.mmd (diagrams/06-activity.mmd). Предварительное резервирование ключа защищает от дублей, но при сбое между резервированием и отправкой возможно пропущенное уведомление. Для прототипа это сознательный выбор в пользу тишины; испытания должны оценить компромисс и при необходимости добавить состояние доставки/повтор с тем же ключом.</w:t>
+        <w:t>Редактируемый исходник PlantUML: 06-activity.puml (diagrams/06-activity.puml). Предварительное резервирование ключа защищает от дублей, но при сбое между резервированием и отправкой возможно пропущенное уведомление. Для прототипа это сознательный выбор в пользу тишины; испытания должны оценить компромисс и при необходимости добавить состояние доставки/повтор с тем же ключом.</w:t>
       </w:r>
     </w:p>
     <w:p>
@@ -529,7 +529,7 @@
       <w:r>
         <w:drawing>
           <wp:inline xmlns:a="http://schemas.openxmlformats.org/drawingml/2006/main" xmlns:pic="http://schemas.openxmlformats.org/drawingml/2006/picture">
-            <wp:extent cx="6263999" cy="4040037"/>
+            <wp:extent cx="6263999" cy="3138959"/>
             <wp:docPr id="7" name="Picture 7"/>
             <wp:cNvGraphicFramePr>
               <a:graphicFrameLocks noChangeAspect="1"/>
@@ -550,7 +550,7 @@
                   <pic:spPr>
                     <a:xfrm>
                       <a:off x="0" y="0"/>
-                      <a:ext cx="6263999" cy="4040037"/>
+                      <a:ext cx="6263999" cy="3138959"/>
                     </a:xfrm>
                     <a:prstGeom prst="rect"/>
                   </pic:spPr>
@@ -575,7 +575,7 @@
     </w:p>
     <w:p>
       <w:r>
-        <w:t>Редактируемый исходник: 07-state.mmd (diagrams/07-state.mmd). Правило антидребезга — проектное дополнение к исходной продуктовой спецификации и проверяется по AC-14.</w:t>
+        <w:t>Редактируемый исходник PlantUML: 07-state.puml (diagrams/07-state.puml). Правило антидребезга — проектное дополнение к исходной продуктовой спецификации и проверяется по AC-14.</w:t>
       </w:r>
     </w:p>
     <w:p>
@@ -604,7 +604,7 @@
       <w:r>
         <w:drawing>
           <wp:inline xmlns:a="http://schemas.openxmlformats.org/drawingml/2006/main" xmlns:pic="http://schemas.openxmlformats.org/drawingml/2006/picture">
-            <wp:extent cx="6263999" cy="4462849"/>
+            <wp:extent cx="6263999" cy="4771025"/>
             <wp:docPr id="8" name="Picture 8"/>
             <wp:cNvGraphicFramePr>
               <a:graphicFrameLocks noChangeAspect="1"/>
@@ -625,7 +625,7 @@
                   <pic:spPr>
                     <a:xfrm>
                       <a:off x="0" y="0"/>
-                      <a:ext cx="6263999" cy="4462849"/>
+                      <a:ext cx="6263999" cy="4771025"/>
                     </a:xfrm>
                     <a:prstGeom prst="rect"/>
                   </pic:spPr>
@@ -650,7 +650,7 @@
     </w:p>
     <w:p>
       <w:r>
-        <w:t>Редактируемый исходник: 08-er.mmd (diagrams/08-er.mmd). Поля source, updated_at, дополнительная диагностика разрешений и индексы могут быть добавлены при физическом проектировании БД; обязательные связи и ключи показаны здесь.</w:t>
+        <w:t>Редактируемый исходник PlantUML: 08-er.puml (diagrams/08-er.puml). Поля source, updated_at, дополнительная диагностика разрешений и индексы могут быть добавлены при физическом проектировании БД; обязательные связи и ключи показаны здесь.</w:t>
       </w:r>
     </w:p>
     <w:p>
@@ -1155,7 +1155,7 @@
     </w:p>
     <w:p>
       <w:r>
-        <w:t>Основание: исходная спецификация (../product-spec.md) и ТЗ ЛР2 (Техническое_задание.md). Все диаграммы доступны как редактируемые .mmd/.puml файлы в репозитории, их визуализации встроены в этот документ. Ссылка на ресурс: &lt;https://github.com/techmo0/GoCue/tree/main/docs/lab-02&gt;.</w:t>
+        <w:t>Основание: исходная спецификация (../product-spec.md) и ТЗ ЛР2 (Техническое_задание.md). Все восемь диаграмм доступны как редактируемые .puml файлы в репозитории, их визуализации встроены в этот документ. Ссылка на ресурс: &lt;https://github.com/techmo0/GoCue/tree/main/docs/lab-02&gt;.</w:t>
       </w:r>
     </w:p>
     <w:sectPr>

</xml_diff>

<commit_message>
Redraw lab 2 context diagram in IDEF0 notation
</commit_message>
<xml_diff>
--- a/docs/lab-02/Технический_проект.docx
+++ b/docs/lab-02/Технический_проект.docx
@@ -63,12 +63,12 @@
         <w:pStyle w:val="Heading1"/>
       </w:pPr>
       <w:r>
-        <w:t>2. Контекстная диаграмма</w:t>
+        <w:t>2. Контекстная диаграмма IDEF0 (A-0)</w:t>
       </w:r>
     </w:p>
     <w:p>
       <w:r>
-        <w:t>Показывает границу GoCue, пользовательский ввод, системные события Android и локальное хранилище. Внешнего сервера нет.</w:t>
+        <w:t>Функция системы — «Возвращать намерения в подходящем месте». Диаграмма A-0 показывает её как один блок с четырьмя типами стрелок: вход слева — намерения, настройки мест и события геозон; управление сверху — разрешения Android, правила контекста, выдержка и дедупликация; выход справа — список дел, групповое уведомление и запись в журнале; механизм снизу — приложение GoCue, системные службы Android и локальная БД. Внешний сервер не требуется.</w:t>
       </w:r>
     </w:p>
     <w:p>
@@ -79,7 +79,7 @@
       <w:r>
         <w:drawing>
           <wp:inline xmlns:a="http://schemas.openxmlformats.org/drawingml/2006/main" xmlns:pic="http://schemas.openxmlformats.org/drawingml/2006/picture">
-            <wp:extent cx="6263999" cy="1686461"/>
+            <wp:extent cx="6263999" cy="3642056"/>
             <wp:docPr id="1" name="Picture 1"/>
             <wp:cNvGraphicFramePr>
               <a:graphicFrameLocks noChangeAspect="1"/>
@@ -100,7 +100,7 @@
                   <pic:spPr>
                     <a:xfrm>
                       <a:off x="0" y="0"/>
-                      <a:ext cx="6263999" cy="1686461"/>
+                      <a:ext cx="6263999" cy="3642056"/>
                     </a:xfrm>
                     <a:prstGeom prst="rect"/>
                   </pic:spPr>
@@ -812,7 +812,7 @@
               <w:rPr>
                 <w:sz w:val="16"/>
               </w:rPr>
-              <w:t>Контекстная</w:t>
+              <w:t>IDEF0 (A-0)</w:t>
             </w:r>
           </w:p>
         </w:tc>

</xml_diff>

<commit_message>
Refine IDEF0 context arrows and rotated labels
</commit_message>
<xml_diff>
--- a/docs/lab-02/Технический_проект.docx
+++ b/docs/lab-02/Технический_проект.docx
@@ -68,7 +68,7 @@
     </w:p>
     <w:p>
       <w:r>
-        <w:t>Функция системы — «Возвращать намерения в подходящем месте». Диаграмма A-0 показывает её как один блок с четырьмя типами стрелок: вход слева — намерения, настройки мест и события геозон; управление сверху — разрешения Android, правила контекста, выдержка и дедупликация; выход справа — список дел, групповое уведомление и запись в журнале; механизм снизу — приложение GoCue, системные службы Android и локальная БД. Внешний сервер не требуется.</w:t>
+        <w:t>Функция системы — «Возвращать намерения в подходящем месте». Диаграмма A-0 показывает её как один блок. Слева входят намерения пользователя, настройки мест и события геозон — каждое по своей стрелке. Сверху отдельно поступают разрешения Android, правила контекста, выдержка и дедупликация. Справа отдельно выходят список подходящих дел, групповое уведомление и запись в журнале событий. Снизу к блоку подходят приложение GoCue, геозоны Android, уведомления Android и локальная БД. Внешний сервер не требуется.</w:t>
       </w:r>
     </w:p>
     <w:p>
@@ -79,7 +79,7 @@
       <w:r>
         <w:drawing>
           <wp:inline xmlns:a="http://schemas.openxmlformats.org/drawingml/2006/main" xmlns:pic="http://schemas.openxmlformats.org/drawingml/2006/picture">
-            <wp:extent cx="6263999" cy="3642056"/>
+            <wp:extent cx="6263999" cy="4802400"/>
             <wp:docPr id="1" name="Picture 1"/>
             <wp:cNvGraphicFramePr>
               <a:graphicFrameLocks noChangeAspect="1"/>
@@ -100,7 +100,7 @@
                   <pic:spPr>
                     <a:xfrm>
                       <a:off x="0" y="0"/>
-                      <a:ext cx="6263999" cy="3642056"/>
+                      <a:ext cx="6263999" cy="4802400"/>
                     </a:xfrm>
                     <a:prstGeom prst="rect"/>
                   </pic:spPr>

</xml_diff>

<commit_message>
Revert "Refine IDEF0 context arrows and rotated labels"
This reverts commit f1ddaa7c37fd3a0fde8fcff828bf3e7bd76b2103.
</commit_message>
<xml_diff>
--- a/docs/lab-02/Технический_проект.docx
+++ b/docs/lab-02/Технический_проект.docx
@@ -68,7 +68,7 @@
     </w:p>
     <w:p>
       <w:r>
-        <w:t>Функция системы — «Возвращать намерения в подходящем месте». Диаграмма A-0 показывает её как один блок. Слева входят намерения пользователя, настройки мест и события геозон — каждое по своей стрелке. Сверху отдельно поступают разрешения Android, правила контекста, выдержка и дедупликация. Справа отдельно выходят список подходящих дел, групповое уведомление и запись в журнале событий. Снизу к блоку подходят приложение GoCue, геозоны Android, уведомления Android и локальная БД. Внешний сервер не требуется.</w:t>
+        <w:t>Функция системы — «Возвращать намерения в подходящем месте». Диаграмма A-0 показывает её как один блок с четырьмя типами стрелок: вход слева — намерения, настройки мест и события геозон; управление сверху — разрешения Android, правила контекста, выдержка и дедупликация; выход справа — список дел, групповое уведомление и запись в журнале; механизм снизу — приложение GoCue, системные службы Android и локальная БД. Внешний сервер не требуется.</w:t>
       </w:r>
     </w:p>
     <w:p>
@@ -79,7 +79,7 @@
       <w:r>
         <w:drawing>
           <wp:inline xmlns:a="http://schemas.openxmlformats.org/drawingml/2006/main" xmlns:pic="http://schemas.openxmlformats.org/drawingml/2006/picture">
-            <wp:extent cx="6263999" cy="4802400"/>
+            <wp:extent cx="6263999" cy="3642056"/>
             <wp:docPr id="1" name="Picture 1"/>
             <wp:cNvGraphicFramePr>
               <a:graphicFrameLocks noChangeAspect="1"/>
@@ -100,7 +100,7 @@
                   <pic:spPr>
                     <a:xfrm>
                       <a:off x="0" y="0"/>
-                      <a:ext cx="6263999" cy="4802400"/>
+                      <a:ext cx="6263999" cy="3642056"/>
                     </a:xfrm>
                     <a:prstGeom prst="rect"/>
                   </pic:spPr>

</xml_diff>

<commit_message>
Simplify visit state diagram in Russian
</commit_message>
<xml_diff>
--- a/docs/lab-02/Технический_проект.docx
+++ b/docs/lab-02/Технический_проект.docx
@@ -518,7 +518,7 @@
     </w:p>
     <w:p>
       <w:r>
-        <w:t>Выбран вариант диаграммы состояний из предложенных заданием. На диаграмме есть техническое состояние EXIT_PENDING: после EXIT запускается 60-секундная антидребезговая пауза. Возврат за это время сохраняет visitId; иначе визит становится ENDED. Состояния OUTSIDE и EXIT_PENDING относятся к Presence Engine; в БД PlaceVisit.state хранит CANDIDATE, CONFIRMED, ENDED, а ожидающий выход может быть представлен отдельным полем/событием таймера.</w:t>
+        <w:t>Выбран вариант диаграммы состояний из предложенных заданием. Она показывает жизненный цикл *одного визита*: после входа в геозону визит начинается, через 60 секунд внутри места подтверждается, а после выхода завершается. Если человек вышел до подтверждения, визит завершается без уведомления. Если уже подтверждённый визит прервался менее чем на 60 секунд, он продолжается с тем же идентификатором. В БД этим этапам соответствуют CANDIDATE, CONFIRMED и ENDED; ожидание после выхода — таймер модуля присутствия, а не дополнительное состояние визита.</w:t>
       </w:r>
     </w:p>
     <w:p>
@@ -529,7 +529,7 @@
       <w:r>
         <w:drawing>
           <wp:inline xmlns:a="http://schemas.openxmlformats.org/drawingml/2006/main" xmlns:pic="http://schemas.openxmlformats.org/drawingml/2006/picture">
-            <wp:extent cx="6263999" cy="3138959"/>
+            <wp:extent cx="6022568" cy="6300000"/>
             <wp:docPr id="7" name="Picture 7"/>
             <wp:cNvGraphicFramePr>
               <a:graphicFrameLocks noChangeAspect="1"/>
@@ -550,7 +550,7 @@
                   <pic:spPr>
                     <a:xfrm>
                       <a:off x="0" y="0"/>
-                      <a:ext cx="6263999" cy="3138959"/>
+                      <a:ext cx="6022568" cy="6300000"/>
                     </a:xfrm>
                     <a:prstGeom prst="rect"/>
                   </pic:spPr>
@@ -575,7 +575,7 @@
     </w:p>
     <w:p>
       <w:r>
-        <w:t>Редактируемый исходник PlantUML: 07-state.puml (diagrams/07-state.puml). Правило антидребезга — проектное дополнение к исходной продуктовой спецификации и проверяется по AC-14.</w:t>
+        <w:t>Редактируемый исходник PlantUML: 07-state.puml (diagrams/07-state.puml). Правило ожидания 60 секунд после выхода — проектное дополнение к исходной продуктовой спецификации и проверяется по AC-14.</w:t>
       </w:r>
     </w:p>
     <w:p>

</xml_diff>